<commit_message>
included dropdown menue to have a detailed view for the sponsors
</commit_message>
<xml_diff>
--- a/wwwroot/configsheets/Informationen/Sponsoren.docx
+++ b/wwwroot/configsheets/Informationen/Sponsoren.docx
@@ -9,7 +9,7 @@
     </w:p>
     <w:p>
       <w:r>
-        <w:t>Aeschlimann Ski Service 4944 Auswil</w:t>
+        <w:t>Aeschlimann Ski Service, 4944 Auswil</w:t>
       </w:r>
     </w:p>
     <w:p>
@@ -19,12 +19,17 @@
     </w:p>
     <w:p>
       <w:r>
+        <w:t>Alain Schnetzer, 4938 Rohrbach</w:t>
+      </w:r>
+    </w:p>
+    <w:p>
+      <w:r>
         <w:t>Architektur M. Lüthi AG, 4938 Rohrbach</w:t>
       </w:r>
     </w:p>
     <w:p>
       <w:r>
-        <w:t>Baumann Fred Kunstmaler 3456 Dürrenroth</w:t>
+        <w:t>Baumann Fred Kunstmaler, 3456 Dürrenroth</w:t>
       </w:r>
     </w:p>
     <w:p>
@@ -54,7 +59,7 @@
     </w:p>
     <w:p>
       <w:r>
-        <w:t>christa minder fotografie gmbh, 4938 Rohrbach</w:t>
+        <w:t>Christa Minder Fotografie GmbH, 4938 Rohrbach</w:t>
       </w:r>
     </w:p>
     <w:p>
@@ -64,7 +69,7 @@
     </w:p>
     <w:p>
       <w:r>
-        <w:t>Coiffeure Tamara 4938 Rohrbach</w:t>
+        <w:t>Coiffeur Tamara, 4938 Rohrbach</w:t>
       </w:r>
     </w:p>
     <w:p>
@@ -74,6 +79,11 @@
     </w:p>
     <w:p>
       <w:r>
+        <w:t>Danièle’s Hofladen, 4938 Rohrbach</w:t>
+      </w:r>
+    </w:p>
+    <w:p>
+      <w:r>
         <w:t>Dipl. Heilpraktikerin Rosmarie Kleeb, 4944 Auswil</w:t>
       </w:r>
     </w:p>
@@ -99,17 +109,17 @@
     </w:p>
     <w:p>
       <w:r>
-        <w:t>Gertrud Flückiger-Jörg 4944 Auswil</w:t>
-      </w:r>
-    </w:p>
-    <w:p>
-      <w:r>
-        <w:t>Gilgen Nyfeler Christa Schriftenmalerei 4938 Rohrbach</w:t>
-      </w:r>
-    </w:p>
-    <w:p>
-      <w:r>
-        <w:t>Gaugesumpfer 4938 Rohrbach</w:t>
+        <w:t>Gaugesumpfer, 4938 Rohrbach</w:t>
+      </w:r>
+    </w:p>
+    <w:p>
+      <w:r>
+        <w:t>Gertrud Flückiger-Jörg, 4944 Auswil</w:t>
+      </w:r>
+    </w:p>
+    <w:p>
+      <w:r>
+        <w:t>Gilgen Nyfeler Christa Schriftenmalerei, 4938 Rohrbach</w:t>
       </w:r>
     </w:p>
     <w:p>
@@ -124,7 +134,7 @@
     </w:p>
     <w:p>
       <w:r>
-        <w:t>H + Z AG 4938 Rohrbach</w:t>
+        <w:t>H + Z AG, 4938 Rohrbach</w:t>
       </w:r>
     </w:p>
     <w:p>
@@ -139,7 +149,7 @@
     </w:p>
     <w:p>
       <w:r>
-        <w:t>HansWerk GmbH 4938 Rohrbach</w:t>
+        <w:t>Hans Werk GmbH, 4938 Rohrbach</w:t>
       </w:r>
     </w:p>
     <w:p>
@@ -154,6 +164,7 @@
     </w:p>
     <w:p>
       <w:r>
+        <w:lastRenderedPageBreak/>
         <w:t>Hundesalon, Tanja's 4 Pfotensalon &amp; Shop, 4938 Rohrbach</w:t>
       </w:r>
     </w:p>
@@ -164,133 +175,158 @@
     </w:p>
     <w:p>
       <w:r>
+        <w:t>Jungschi Wälle, Kirchgemeinde Rohrbach, 4938 Rohrbach</w:t>
+      </w:r>
+    </w:p>
+    <w:p>
+      <w:r>
+        <w:t>Karin Mathys, Lebens-Sterbe-Trauerbegleitung und Bestatterin, 4938 Rohrbach</w:t>
+      </w:r>
+    </w:p>
+    <w:p>
+      <w:r>
+        <w:t>Kronen Garage, Ernst Scheidegger, 4938 Rohrbach</w:t>
+      </w:r>
+    </w:p>
+    <w:p>
+      <w:r>
+        <w:t>Lanz Holzbau AG, 4938 Rohrbach</w:t>
+      </w:r>
+    </w:p>
+    <w:p>
+      <w:r>
+        <w:t>Lanz-Anliker AG, 4938 Rohrbach</w:t>
+      </w:r>
+    </w:p>
+    <w:p>
+      <w:r>
+        <w:t>Loosli Gartenwelt GmbH, 4938 Rohrbach</w:t>
+      </w:r>
+    </w:p>
+    <w:p>
+      <w:r>
+        <w:t>Massage- u. Reflexzonen Therapie, Veronika Graber-Minder, 4944 Auswil</w:t>
+      </w:r>
+    </w:p>
+    <w:p>
+      <w:r>
+        <w:t>Massage-Therapie u. Solarium-Sauna, Erich Altorfer, 4938 Rohrbach</w:t>
+      </w:r>
+    </w:p>
+    <w:p>
+      <w:r>
+        <w:t>Mauro Faenzi, unabhängige Versicherung und Finanzplanung, 4938 Rohrbach</w:t>
+      </w:r>
+    </w:p>
+    <w:p>
+      <w:r>
+        <w:t>MC Donalds, 4900 Langenthal</w:t>
+      </w:r>
+    </w:p>
+    <w:p>
+      <w:r>
+        <w:t>Millenium Computers, Res Derendinger, 4938 Rohrbach</w:t>
+      </w:r>
+    </w:p>
+    <w:p>
+      <w:r>
+        <w:t>Neustart, Strahm Ursula, 4944 Auswil</w:t>
+      </w:r>
+    </w:p>
+    <w:p>
+      <w:r>
+        <w:t>OTTO'S AG, 6210 Sursee</w:t>
+      </w:r>
+    </w:p>
+    <w:p>
+      <w:r>
+        <w:t>Peter Beutler, 4938 Rohrbach</w:t>
+      </w:r>
+    </w:p>
+    <w:p>
+      <w:r>
+        <w:t>Pizza Oregano, 4938 Rohrbach</w:t>
+      </w:r>
+    </w:p>
+    <w:p>
+      <w:r>
+        <w:t>Rachdi Menel Manuel, Kunstmaler, 4944 Auswil</w:t>
+      </w:r>
+    </w:p>
+    <w:p>
+      <w:r>
+        <w:t>Raymond Schärer, 4938 Rohrbach</w:t>
+      </w:r>
+    </w:p>
+    <w:p>
+      <w:r>
+        <w:t>Reschtu GmbH, 4938 Rohrbach</w:t>
+      </w:r>
+    </w:p>
+    <w:p>
+      <w:r>
+        <w:t>Restaurant Bären, Gugan, 4938 Rohrbach</w:t>
+      </w:r>
+    </w:p>
+    <w:p>
+      <w:r>
+        <w:t>Restaurant Eintracht, Steiner Beat und Sonja, 4938 Rohrbach</w:t>
+      </w:r>
+    </w:p>
+    <w:p>
+      <w:r>
+        <w:t>Rolf Krähenbühl, 4938 Rohrbach</w:t>
+      </w:r>
+    </w:p>
+    <w:p>
+      <w:r>
+        <w:t>Roli's Möbelmarkt AG, 4938 Rohrbach</w:t>
+      </w:r>
+    </w:p>
+    <w:p>
+      <w:r>
+        <w:t>Royal Reinigungen, 4938 Rohrbach</w:t>
+      </w:r>
+    </w:p>
+    <w:p>
+      <w:r>
+        <w:t>S. Flückiger AG, 4944 Auswil</w:t>
+      </w:r>
+    </w:p>
+    <w:p>
+      <w:r>
+        <w:t>Sabine Fluri, Schlittenhunde, 4955 Gondiswil</w:t>
+      </w:r>
+    </w:p>
+    <w:p>
+      <w:r>
+        <w:t>Sarah Buri Hundesalon Fellart, 4938 Rohrbach</w:t>
+      </w:r>
+    </w:p>
+    <w:p>
+      <w:r>
+        <w:t>Scheidegger AG, Schreinerei - Holzbau, 4938 Rohrbachgraben</w:t>
+      </w:r>
+    </w:p>
+    <w:p>
+      <w:r>
+        <w:t>Scherenschnitte Esther Gerber GmbH, 4938 Rohrbach</w:t>
+      </w:r>
+    </w:p>
+    <w:p>
+      <w:r>
+        <w:t>Singeisen Raphael, 4938 Rohrbach</w:t>
+      </w:r>
+    </w:p>
+    <w:p>
+      <w:r>
+        <w:t>Skating Club, 4950 Huttwil</w:t>
+      </w:r>
+    </w:p>
+    <w:p>
+      <w:r>
         <w:lastRenderedPageBreak/>
-        <w:t>Jungschi Wälle, Kirchgemeinde Rohrbach, 4938 Rohrbach</w:t>
-      </w:r>
-    </w:p>
-    <w:p>
-      <w:r>
-        <w:t>Karin Mathys, Lebens-Sterbe-Trauerbegleitung und Bestatterin</w:t>
-      </w:r>
-    </w:p>
-    <w:p>
-      <w:r>
-        <w:t>Kronen Garage, Ernst Scheidegger, 4938 Rohrbach</w:t>
-      </w:r>
-    </w:p>
-    <w:p>
-      <w:r>
-        <w:t>Lanz Holzbau AG, 4938 Rohrbach</w:t>
-      </w:r>
-    </w:p>
-    <w:p>
-      <w:r>
-        <w:t>Lanz-Anliker AG, 4938 Rohrbach</w:t>
-      </w:r>
-    </w:p>
-    <w:p>
-      <w:r>
-        <w:t>Loosli Gartenwelt GmbH, 4938 Rohrbach</w:t>
-      </w:r>
-    </w:p>
-    <w:p>
-      <w:r>
-        <w:t>Massage- u. Reflexzonen Therapie, Veronika Graber-Minder, 4944 Auswil</w:t>
-      </w:r>
-    </w:p>
-    <w:p>
-      <w:r>
-        <w:t>Massage-Therapie u. Solarium-Sauna, Erich Altorfer, 4938 Rohrbach</w:t>
-      </w:r>
-    </w:p>
-    <w:p>
-      <w:r>
-        <w:t>Mauro Faenzi, unabhängige Versicherung und Finanzplanung, 4938 Rohrbach</w:t>
-      </w:r>
-    </w:p>
-    <w:p>
-      <w:r>
-        <w:t>Millenium Computers, Res Derendinger, 4938 Rohrbach</w:t>
-      </w:r>
-    </w:p>
-    <w:p>
-      <w:r>
-        <w:t>Neustart, Strahm Ursula, 4944 Auswil</w:t>
-      </w:r>
-    </w:p>
-    <w:p>
-      <w:r>
-        <w:t>MC Donalds, 4900 Langenthal</w:t>
-      </w:r>
-    </w:p>
-    <w:p>
-      <w:r>
-        <w:t>OTTO'S AG, 6210 Sursee</w:t>
-      </w:r>
-    </w:p>
-    <w:p>
-      <w:r>
-        <w:t>Pizza Oregano, 4938 Rohrbach</w:t>
-      </w:r>
-    </w:p>
-    <w:p>
-      <w:r>
-        <w:t>Rachdi Menel Manuel, Kunstmaler, 4944 Auswil</w:t>
-      </w:r>
-    </w:p>
-    <w:p>
-      <w:r>
-        <w:t>Raymond Schärerer 4938 Rohrbach</w:t>
-      </w:r>
-    </w:p>
-    <w:p>
-      <w:r>
-        <w:t>Reschtu GmbH, 4938 Rohrbach</w:t>
-      </w:r>
-    </w:p>
-    <w:p>
-      <w:r>
-        <w:t>Restaurant Bären, Gugan, 4938 Rohrbach</w:t>
-      </w:r>
-    </w:p>
-    <w:p>
-      <w:r>
-        <w:t>Restaurant Eintracht, Steiner Beat und Sonja, 4938 Rohrbach</w:t>
-      </w:r>
-    </w:p>
-    <w:p>
-      <w:r>
-        <w:t>Roli's Möbelmarkt AG, 4938 Rohrbach</w:t>
-      </w:r>
-    </w:p>
-    <w:p>
-      <w:r>
-        <w:t>Sabine Fluri, Schlittenhunde 4955 Gondiswil</w:t>
-      </w:r>
-    </w:p>
-    <w:p>
-      <w:r>
-        <w:t>S. Flückiger AG, 4944 Auswil</w:t>
-      </w:r>
-    </w:p>
-    <w:p>
-      <w:r>
-        <w:t>Sarah Buri Hundesalon Fellart 4938 Rohrbach</w:t>
-      </w:r>
-    </w:p>
-    <w:p>
-      <w:r>
-        <w:t>Scheidegger AG, Schreinerei - Holzbau, 4938 Rohrbachgraben</w:t>
-      </w:r>
-    </w:p>
-    <w:p>
-      <w:r>
-        <w:t>Scherenschnitte Esther Gerber GmbH, 4938 Rohrbach</w:t>
-      </w:r>
-    </w:p>
-    <w:p>
-      <w:r>
-        <w:t>Singeisen Raphael 4938 Rohrbach</w:t>
+        <w:t>Verschönerungsverein, 4938 Rohrbach</w:t>
       </w:r>
     </w:p>
     <w:p>
@@ -310,21 +346,10 @@
     </w:p>
     <w:p>
       <w:r>
-        <w:t>Danièle's Hofladen</w:t>
-      </w:r>
-      <w:r>
-        <w:t xml:space="preserve">, </w:t>
-      </w:r>
-      <w:r>
-        <w:t>Hintergasse 7</w:t>
-      </w:r>
-      <w:r>
-        <w:t xml:space="preserve">, </w:t>
-      </w:r>
-      <w:r>
-        <w:t>4938 Rohrbach</w:t>
-      </w:r>
-    </w:p>
+        <w:t>Yamaha, Hostettler AG, 6210 Sursee</w:t>
+      </w:r>
+    </w:p>
+    <w:p/>
     <w:sectPr>
       <w:pgSz w:w="11906" w:h="16838"/>
       <w:pgMar w:top="1417" w:right="1417" w:bottom="1134" w:left="1417" w:header="708" w:footer="708" w:gutter="0"/>

</xml_diff>